<commit_message>
se creo credenciales de acceso
</commit_message>
<xml_diff>
--- a/public/Informe_mto_otrosi_fads.docx
+++ b/public/Informe_mto_otrosi_fads.docx
@@ -54,15 +54,23 @@
               <w:jc w:val="center"/>
               <w:rPr>
                 <w:rFonts w:ascii="Calibri" w:hAnsi="Calibri"/>
-                <w:lang w:eastAsia="es-CO"/>
-              </w:rPr>
-            </w:pPr>
-            <w:r>
-              <w:rPr>
-                <w:rFonts w:ascii="Calibri" w:hAnsi="Calibri"/>
-                <w:lang w:eastAsia="es-CO"/>
-              </w:rPr>
-              <w:t xml:space="preserve">General y Otro si 7 </w:t>
+                <w:u w:val="single"/>
+                <w:lang w:eastAsia="es-CO"/>
+              </w:rPr>
+            </w:pPr>
+            <w:r>
+              <w:rPr>
+                <w:rFonts w:ascii="Calibri" w:hAnsi="Calibri"/>
+                <w:lang w:eastAsia="es-CO"/>
+              </w:rPr>
+              <w:t xml:space="preserve">General y Otro si </w:t>
+            </w:r>
+            <w:r>
+              <w:rPr>
+                <w:rFonts w:ascii="Calibri" w:hAnsi="Calibri"/>
+                <w:lang w:eastAsia="es-CO"/>
+              </w:rPr>
+              <w:t>__</w:t>
             </w:r>
           </w:p>
           <w:p>
@@ -370,7 +378,23 @@
                 <w:sz w:val="18"/>
                 <w:szCs w:val="18"/>
               </w:rPr>
-              <w:t>REGISTRO ANTES MANTENIMEINTO</w:t>
+              <w:t>REGISTRO ANTES MANTENIM</w:t>
+            </w:r>
+            <w:r>
+              <w:rPr>
+                <w:rFonts w:ascii="Calibri" w:hAnsi="Calibri" w:cs="Calibri"/>
+                <w:sz w:val="18"/>
+                <w:szCs w:val="18"/>
+              </w:rPr>
+              <w:t>IE</w:t>
+            </w:r>
+            <w:r>
+              <w:rPr>
+                <w:rFonts w:ascii="Calibri" w:hAnsi="Calibri" w:cs="Calibri"/>
+                <w:sz w:val="18"/>
+                <w:szCs w:val="18"/>
+              </w:rPr>
+              <w:t>NTO</w:t>
             </w:r>
           </w:p>
         </w:tc>
@@ -394,7 +418,23 @@
                 <w:sz w:val="18"/>
                 <w:szCs w:val="18"/>
               </w:rPr>
-              <w:t>REGISTRO DESPUES MANTENIMIENTO</w:t>
+              <w:t>REGISTRO DESPUES MANTENIM</w:t>
+            </w:r>
+            <w:r>
+              <w:rPr>
+                <w:rFonts w:ascii="Calibri" w:hAnsi="Calibri" w:cs="Calibri"/>
+                <w:sz w:val="18"/>
+                <w:szCs w:val="18"/>
+              </w:rPr>
+              <w:t>IE</w:t>
+            </w:r>
+            <w:r>
+              <w:rPr>
+                <w:rFonts w:ascii="Calibri" w:hAnsi="Calibri" w:cs="Calibri"/>
+                <w:sz w:val="18"/>
+                <w:szCs w:val="18"/>
+              </w:rPr>
+              <w:t>NTO</w:t>
             </w:r>
           </w:p>
         </w:tc>
@@ -409,7 +449,15 @@
               <w:jc w:val="center"/>
             </w:pPr>
             <w:r>
-              <w:t>{#reporte}{item}</w:t>
+              <w:t>{#</w:t>
+            </w:r>
+            <w:proofErr w:type="gramStart"/>
+            <w:r>
+              <w:t>reporte}{</w:t>
+            </w:r>
+            <w:proofErr w:type="gramEnd"/>
+            <w:r>
+              <w:t>item}</w:t>
             </w:r>
           </w:p>
         </w:tc>
@@ -500,11 +548,19 @@
             </w:r>
             <w:proofErr w:type="spellStart"/>
             <w:r>
-              <w:t>foto_despues</w:t>
+              <w:t>foto_</w:t>
+            </w:r>
+            <w:proofErr w:type="gramStart"/>
+            <w:r>
+              <w:t>despues</w:t>
             </w:r>
             <w:proofErr w:type="spellEnd"/>
             <w:r>
-              <w:t>}{/reporte}</w:t>
+              <w:t>}{</w:t>
+            </w:r>
+            <w:proofErr w:type="gramEnd"/>
+            <w:r>
+              <w:t>/reporte}</w:t>
             </w:r>
           </w:p>
         </w:tc>

</xml_diff>